<commit_message>
Fix: resolve requirements conflict and merge local changes
</commit_message>
<xml_diff>
--- a/تحليل خوارزمية Watershed.docx
+++ b/تحليل خوارزمية Watershed.docx
@@ -9,6 +9,9 @@
           <w:rtl/>
         </w:rPr>
       </w:pPr>
+      <w:r>
+        <w:t>s</w:t>
+      </w:r>
     </w:p>
     <w:p>
       <w:pPr>
@@ -5461,6 +5464,7 @@
       <w:r>
         <w:rPr>
           <w:rFonts w:cs="Arial"/>
+          <w:noProof/>
           <w:rtl/>
         </w:rPr>
         <w:drawing>
@@ -6331,6 +6335,7 @@
   <w:style w:type="character" w:default="1" w:styleId="DefaultParagraphFont">
     <w:name w:val="Default Paragraph Font"/>
     <w:uiPriority w:val="1"/>
+    <w:semiHidden/>
     <w:unhideWhenUsed/>
   </w:style>
   <w:style w:type="table" w:default="1" w:styleId="TableNormal">

</xml_diff>